<commit_message>
Updated MedFi doc with own addition
</commit_message>
<xml_diff>
--- a/Radius_Design_Files/CAB302-Assessment1-Med-Fi.docx
+++ b/Radius_Design_Files/CAB302-Assessment1-Med-Fi.docx
@@ -3,95 +3,6 @@
 <w:document xmlns:wpc="http://schemas.microsoft.com/office/word/2010/wordprocessingCanvas" xmlns:cx="http://schemas.microsoft.com/office/drawing/2014/chartex" xmlns:cx1="http://schemas.microsoft.com/office/drawing/2015/9/8/chartex" xmlns:cx2="http://schemas.microsoft.com/office/drawing/2015/10/21/chartex" xmlns:cx3="http://schemas.microsoft.com/office/drawing/2016/5/9/chartex" xmlns:cx4="http://schemas.microsoft.com/office/drawing/2016/5/10/chartex" xmlns:cx5="http://schemas.microsoft.com/office/drawing/2016/5/11/chartex" xmlns:cx6="http://schemas.microsoft.com/office/drawing/2016/5/12/chartex" xmlns:cx7="http://schemas.microsoft.com/office/drawing/2016/5/13/chartex" xmlns:cx8="http://schemas.microsoft.com/office/drawing/2016/5/14/chartex" xmlns:mc="http://schemas.openxmlformats.org/markup-compatibility/2006" xmlns:aink="http://schemas.microsoft.com/office/drawing/2016/ink" xmlns:am3d="http://schemas.microsoft.com/office/drawing/2017/model3d" xmlns:o="urn:schemas-microsoft-com:office:office" xmlns:oel="http://schemas.microsoft.com/office/2019/extlst" xmlns:r="http://schemas.openxmlformats.org/officeDocument/2006/relationships" xmlns:m="http://schemas.openxmlformats.org/officeDocument/2006/math" xmlns:v="urn:schemas-microsoft-com:vml" xmlns:wp14="http://schemas.microsoft.com/office/word/2010/wordprocessingDrawing" xmlns:wp="http://schemas.openxmlformats.org/drawingml/2006/wordprocessingDrawing" xmlns:w10="urn:schemas-microsoft-com:office:word" xmlns:w="http://schemas.openxmlformats.org/wordprocessingml/2006/main" xmlns:w14="http://schemas.microsoft.com/office/word/2010/wordml" xmlns:w15="http://schemas.microsoft.com/office/word/2012/wordml" xmlns:w16cex="http://schemas.microsoft.com/office/word/2018/wordml/cex" xmlns:w16cid="http://schemas.microsoft.com/office/word/2016/wordml/cid" xmlns:w16="http://schemas.microsoft.com/office/word/2018/wordml" xmlns:w16du="http://schemas.microsoft.com/office/word/2023/wordml/word16du" xmlns:w16sdtdh="http://schemas.microsoft.com/office/word/2020/wordml/sdtdatahash" xmlns:w16sdtfl="http://schemas.microsoft.com/office/word/2024/wordml/sdtformatlock" xmlns:w16se="http://schemas.microsoft.com/office/word/2015/wordml/symex" xmlns:wpg="http://schemas.microsoft.com/office/word/2010/wordprocessingGroup" xmlns:wpi="http://schemas.microsoft.com/office/word/2010/wordprocessingInk" xmlns:wne="http://schemas.microsoft.com/office/word/2006/wordml" xmlns:wps="http://schemas.microsoft.com/office/word/2010/wordprocessingShape" mc:Ignorable="w14 w15 w16se w16cid w16 w16cex w16sdtdh w16sdtfl w16du wp14">
   <w:body>
     <w:p>
-      <w:r>
-        <w:rPr>
-          <w:noProof/>
-        </w:rPr>
-        <mc:AlternateContent>
-          <mc:Choice Requires="wps">
-            <w:drawing>
-              <wp:anchor distT="45720" distB="45720" distL="114300" distR="114300" simplePos="0" relativeHeight="251674624" behindDoc="1" locked="0" layoutInCell="1" allowOverlap="1" wp14:anchorId="396E5DC3" wp14:editId="4C4B576A">
-                <wp:simplePos x="0" y="0"/>
-                <wp:positionH relativeFrom="column">
-                  <wp:posOffset>-78343</wp:posOffset>
-                </wp:positionH>
-                <wp:positionV relativeFrom="paragraph">
-                  <wp:posOffset>-772554</wp:posOffset>
-                </wp:positionV>
-                <wp:extent cx="2360930" cy="1404620"/>
-                <wp:effectExtent l="0" t="0" r="0" b="1905"/>
-                <wp:wrapNone/>
-                <wp:docPr id="217" name="Text Box 2"/>
-                <wp:cNvGraphicFramePr>
-                  <a:graphicFrameLocks xmlns:a="http://schemas.openxmlformats.org/drawingml/2006/main"/>
-                </wp:cNvGraphicFramePr>
-                <a:graphic xmlns:a="http://schemas.openxmlformats.org/drawingml/2006/main">
-                  <a:graphicData uri="http://schemas.microsoft.com/office/word/2010/wordprocessingShape">
-                    <wps:wsp>
-                      <wps:cNvSpPr txBox="1">
-                        <a:spLocks noChangeArrowheads="1"/>
-                      </wps:cNvSpPr>
-                      <wps:spPr bwMode="auto">
-                        <a:xfrm>
-                          <a:off x="0" y="0"/>
-                          <a:ext cx="2360930" cy="1404620"/>
-                        </a:xfrm>
-                        <a:prstGeom prst="rect">
-                          <a:avLst/>
-                        </a:prstGeom>
-                        <a:noFill/>
-                        <a:ln w="9525">
-                          <a:noFill/>
-                          <a:miter lim="800000"/>
-                          <a:headEnd/>
-                          <a:tailEnd/>
-                        </a:ln>
-                      </wps:spPr>
-                      <wps:txbx>
-                        <w:txbxContent>
-                          <w:p>
-                            <w:r>
-                              <w:t>Author: Jack</w:t>
-                            </w:r>
-                          </w:p>
-                        </w:txbxContent>
-                      </wps:txbx>
-                      <wps:bodyPr rot="0" vert="horz" wrap="square" lIns="91440" tIns="45720" rIns="91440" bIns="45720" anchor="t" anchorCtr="0">
-                        <a:spAutoFit/>
-                      </wps:bodyPr>
-                    </wps:wsp>
-                  </a:graphicData>
-                </a:graphic>
-                <wp14:sizeRelH relativeFrom="margin">
-                  <wp14:pctWidth>40000</wp14:pctWidth>
-                </wp14:sizeRelH>
-                <wp14:sizeRelV relativeFrom="margin">
-                  <wp14:pctHeight>20000</wp14:pctHeight>
-                </wp14:sizeRelV>
-              </wp:anchor>
-            </w:drawing>
-          </mc:Choice>
-          <mc:Fallback>
-            <w:pict>
-              <v:shapetype w14:anchorId="396E5DC3" id="_x0000_t202" coordsize="21600,21600" o:spt="202" path="m,l,21600r21600,l21600,xe">
-                <v:stroke joinstyle="miter"/>
-                <v:path gradientshapeok="t" o:connecttype="rect"/>
-              </v:shapetype>
-              <v:shape id="Text Box 2" o:spid="_x0000_s1026" type="#_x0000_t202" style="position:absolute;margin-left:-6.15pt;margin-top:-60.85pt;width:185.9pt;height:110.6pt;z-index:-251641856;visibility:visible;mso-wrap-style:square;mso-width-percent:400;mso-height-percent:200;mso-wrap-distance-left:9pt;mso-wrap-distance-top:3.6pt;mso-wrap-distance-right:9pt;mso-wrap-distance-bottom:3.6pt;mso-position-horizontal:absolute;mso-position-horizontal-relative:text;mso-position-vertical:absolute;mso-position-vertical-relative:text;mso-width-percent:400;mso-height-percent:200;mso-width-relative:margin;mso-height-relative:margin;v-text-anchor:top" o:gfxdata="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" filled="f" stroked="f">
-                <v:textbox style="mso-fit-shape-to-text:t">
-                  <w:txbxContent>
-                    <w:p>
-                      <w:r>
-                        <w:t>Author: Jack</w:t>
-                      </w:r>
-                    </w:p>
-                  </w:txbxContent>
-                </v:textbox>
-              </v:shape>
-            </w:pict>
-          </mc:Fallback>
-        </mc:AlternateContent>
-      </w:r>
       <w:r>
         <w:rPr>
           <w:noProof/>
@@ -649,7 +560,382 @@
         </w:drawing>
       </w:r>
     </w:p>
-    <w:p/>
+    <w:p>
+      <w:r>
+        <w:br w:type="page"/>
+      </w:r>
+    </w:p>
+    <w:p>
+      <w:r>
+        <w:rPr>
+          <w:noProof/>
+        </w:rPr>
+        <w:lastRenderedPageBreak/>
+        <w:drawing>
+          <wp:anchor distT="0" distB="0" distL="114300" distR="114300" simplePos="0" relativeHeight="251667456" behindDoc="1" locked="0" layoutInCell="1" allowOverlap="1" wp14:anchorId="31216D2E" wp14:editId="7FB4FC4E">
+            <wp:simplePos x="0" y="0"/>
+            <wp:positionH relativeFrom="margin">
+              <wp:posOffset>3587918</wp:posOffset>
+            </wp:positionH>
+            <wp:positionV relativeFrom="paragraph">
+              <wp:posOffset>-365448</wp:posOffset>
+            </wp:positionV>
+            <wp:extent cx="2162369" cy="4680000"/>
+            <wp:effectExtent l="0" t="0" r="9525" b="6350"/>
+            <wp:wrapNone/>
+            <wp:docPr id="470188710" name="Picture 10"/>
+            <wp:cNvGraphicFramePr>
+              <a:graphicFrameLocks xmlns:a="http://schemas.openxmlformats.org/drawingml/2006/main" noChangeAspect="1"/>
+            </wp:cNvGraphicFramePr>
+            <a:graphic xmlns:a="http://schemas.openxmlformats.org/drawingml/2006/main">
+              <a:graphicData uri="http://schemas.openxmlformats.org/drawingml/2006/picture">
+                <pic:pic xmlns:pic="http://schemas.openxmlformats.org/drawingml/2006/picture">
+                  <pic:nvPicPr>
+                    <pic:cNvPr id="470188710" name="Picture 470188710"/>
+                    <pic:cNvPicPr/>
+                  </pic:nvPicPr>
+                  <pic:blipFill>
+                    <a:blip r:embed="rId13">
+                      <a:extLst>
+                        <a:ext uri="{28A0092B-C50C-407E-A947-70E740481C1C}">
+                          <a14:useLocalDpi xmlns:a14="http://schemas.microsoft.com/office/drawing/2010/main" val="0"/>
+                        </a:ext>
+                      </a:extLst>
+                    </a:blip>
+                    <a:stretch>
+                      <a:fillRect/>
+                    </a:stretch>
+                  </pic:blipFill>
+                  <pic:spPr>
+                    <a:xfrm>
+                      <a:off x="0" y="0"/>
+                      <a:ext cx="2162369" cy="4680000"/>
+                    </a:xfrm>
+                    <a:prstGeom prst="rect">
+                      <a:avLst/>
+                    </a:prstGeom>
+                  </pic:spPr>
+                </pic:pic>
+              </a:graphicData>
+            </a:graphic>
+            <wp14:sizeRelH relativeFrom="margin">
+              <wp14:pctWidth>0</wp14:pctWidth>
+            </wp14:sizeRelH>
+            <wp14:sizeRelV relativeFrom="margin">
+              <wp14:pctHeight>0</wp14:pctHeight>
+            </wp14:sizeRelV>
+          </wp:anchor>
+        </w:drawing>
+      </w:r>
+      <w:r>
+        <w:rPr>
+          <w:noProof/>
+        </w:rPr>
+        <w:drawing>
+          <wp:anchor distT="0" distB="0" distL="114300" distR="114300" simplePos="0" relativeHeight="251666432" behindDoc="1" locked="0" layoutInCell="1" allowOverlap="1" wp14:anchorId="55858995" wp14:editId="7BC83550">
+            <wp:simplePos x="0" y="0"/>
+            <wp:positionH relativeFrom="margin">
+              <wp:posOffset>-1641</wp:posOffset>
+            </wp:positionH>
+            <wp:positionV relativeFrom="paragraph">
+              <wp:posOffset>-362477</wp:posOffset>
+            </wp:positionV>
+            <wp:extent cx="2142285" cy="4680000"/>
+            <wp:effectExtent l="0" t="0" r="0" b="6350"/>
+            <wp:wrapNone/>
+            <wp:docPr id="882079457" name="Picture 9"/>
+            <wp:cNvGraphicFramePr>
+              <a:graphicFrameLocks xmlns:a="http://schemas.openxmlformats.org/drawingml/2006/main" noChangeAspect="1"/>
+            </wp:cNvGraphicFramePr>
+            <a:graphic xmlns:a="http://schemas.openxmlformats.org/drawingml/2006/main">
+              <a:graphicData uri="http://schemas.openxmlformats.org/drawingml/2006/picture">
+                <pic:pic xmlns:pic="http://schemas.openxmlformats.org/drawingml/2006/picture">
+                  <pic:nvPicPr>
+                    <pic:cNvPr id="882079457" name="Picture 882079457"/>
+                    <pic:cNvPicPr/>
+                  </pic:nvPicPr>
+                  <pic:blipFill>
+                    <a:blip r:embed="rId14">
+                      <a:extLst>
+                        <a:ext uri="{28A0092B-C50C-407E-A947-70E740481C1C}">
+                          <a14:useLocalDpi xmlns:a14="http://schemas.microsoft.com/office/drawing/2010/main" val="0"/>
+                        </a:ext>
+                      </a:extLst>
+                    </a:blip>
+                    <a:stretch>
+                      <a:fillRect/>
+                    </a:stretch>
+                  </pic:blipFill>
+                  <pic:spPr>
+                    <a:xfrm>
+                      <a:off x="0" y="0"/>
+                      <a:ext cx="2142285" cy="4680000"/>
+                    </a:xfrm>
+                    <a:prstGeom prst="rect">
+                      <a:avLst/>
+                    </a:prstGeom>
+                  </pic:spPr>
+                </pic:pic>
+              </a:graphicData>
+            </a:graphic>
+            <wp14:sizeRelH relativeFrom="margin">
+              <wp14:pctWidth>0</wp14:pctWidth>
+            </wp14:sizeRelH>
+            <wp14:sizeRelV relativeFrom="margin">
+              <wp14:pctHeight>0</wp14:pctHeight>
+            </wp14:sizeRelV>
+          </wp:anchor>
+        </w:drawing>
+      </w:r>
+    </w:p>
+    <w:p>
+      <w:r>
+        <w:rPr>
+          <w:noProof/>
+        </w:rPr>
+        <w:drawing>
+          <wp:anchor distT="0" distB="0" distL="114300" distR="114300" simplePos="0" relativeHeight="251669504" behindDoc="1" locked="0" layoutInCell="1" allowOverlap="1" wp14:anchorId="133D5A03" wp14:editId="2A340DBE">
+            <wp:simplePos x="0" y="0"/>
+            <wp:positionH relativeFrom="column">
+              <wp:posOffset>13335</wp:posOffset>
+            </wp:positionH>
+            <wp:positionV relativeFrom="paragraph">
+              <wp:posOffset>4371198</wp:posOffset>
+            </wp:positionV>
+            <wp:extent cx="2138649" cy="4680000"/>
+            <wp:effectExtent l="0" t="0" r="0" b="6350"/>
+            <wp:wrapNone/>
+            <wp:docPr id="2104870737" name="Picture 12"/>
+            <wp:cNvGraphicFramePr>
+              <a:graphicFrameLocks xmlns:a="http://schemas.openxmlformats.org/drawingml/2006/main" noChangeAspect="1"/>
+            </wp:cNvGraphicFramePr>
+            <a:graphic xmlns:a="http://schemas.openxmlformats.org/drawingml/2006/main">
+              <a:graphicData uri="http://schemas.openxmlformats.org/drawingml/2006/picture">
+                <pic:pic xmlns:pic="http://schemas.openxmlformats.org/drawingml/2006/picture">
+                  <pic:nvPicPr>
+                    <pic:cNvPr id="2104870737" name="Picture 2104870737"/>
+                    <pic:cNvPicPr/>
+                  </pic:nvPicPr>
+                  <pic:blipFill>
+                    <a:blip r:embed="rId15">
+                      <a:extLst>
+                        <a:ext uri="{28A0092B-C50C-407E-A947-70E740481C1C}">
+                          <a14:useLocalDpi xmlns:a14="http://schemas.microsoft.com/office/drawing/2010/main" val="0"/>
+                        </a:ext>
+                      </a:extLst>
+                    </a:blip>
+                    <a:stretch>
+                      <a:fillRect/>
+                    </a:stretch>
+                  </pic:blipFill>
+                  <pic:spPr>
+                    <a:xfrm>
+                      <a:off x="0" y="0"/>
+                      <a:ext cx="2138649" cy="4680000"/>
+                    </a:xfrm>
+                    <a:prstGeom prst="rect">
+                      <a:avLst/>
+                    </a:prstGeom>
+                  </pic:spPr>
+                </pic:pic>
+              </a:graphicData>
+            </a:graphic>
+            <wp14:sizeRelH relativeFrom="margin">
+              <wp14:pctWidth>0</wp14:pctWidth>
+            </wp14:sizeRelH>
+            <wp14:sizeRelV relativeFrom="margin">
+              <wp14:pctHeight>0</wp14:pctHeight>
+            </wp14:sizeRelV>
+          </wp:anchor>
+        </w:drawing>
+      </w:r>
+      <w:r>
+        <w:rPr>
+          <w:noProof/>
+        </w:rPr>
+        <w:drawing>
+          <wp:anchor distT="0" distB="0" distL="114300" distR="114300" simplePos="0" relativeHeight="251668480" behindDoc="1" locked="0" layoutInCell="1" allowOverlap="1" wp14:anchorId="782597F0" wp14:editId="77A010CB">
+            <wp:simplePos x="0" y="0"/>
+            <wp:positionH relativeFrom="column">
+              <wp:posOffset>3631565</wp:posOffset>
+            </wp:positionH>
+            <wp:positionV relativeFrom="paragraph">
+              <wp:posOffset>4366236</wp:posOffset>
+            </wp:positionV>
+            <wp:extent cx="2119170" cy="4680000"/>
+            <wp:effectExtent l="0" t="0" r="0" b="6350"/>
+            <wp:wrapNone/>
+            <wp:docPr id="604034121" name="Picture 11"/>
+            <wp:cNvGraphicFramePr>
+              <a:graphicFrameLocks xmlns:a="http://schemas.openxmlformats.org/drawingml/2006/main" noChangeAspect="1"/>
+            </wp:cNvGraphicFramePr>
+            <a:graphic xmlns:a="http://schemas.openxmlformats.org/drawingml/2006/main">
+              <a:graphicData uri="http://schemas.openxmlformats.org/drawingml/2006/picture">
+                <pic:pic xmlns:pic="http://schemas.openxmlformats.org/drawingml/2006/picture">
+                  <pic:nvPicPr>
+                    <pic:cNvPr id="604034121" name="Picture 604034121"/>
+                    <pic:cNvPicPr/>
+                  </pic:nvPicPr>
+                  <pic:blipFill>
+                    <a:blip r:embed="rId16">
+                      <a:extLst>
+                        <a:ext uri="{28A0092B-C50C-407E-A947-70E740481C1C}">
+                          <a14:useLocalDpi xmlns:a14="http://schemas.microsoft.com/office/drawing/2010/main" val="0"/>
+                        </a:ext>
+                      </a:extLst>
+                    </a:blip>
+                    <a:stretch>
+                      <a:fillRect/>
+                    </a:stretch>
+                  </pic:blipFill>
+                  <pic:spPr>
+                    <a:xfrm>
+                      <a:off x="0" y="0"/>
+                      <a:ext cx="2119170" cy="4680000"/>
+                    </a:xfrm>
+                    <a:prstGeom prst="rect">
+                      <a:avLst/>
+                    </a:prstGeom>
+                  </pic:spPr>
+                </pic:pic>
+              </a:graphicData>
+            </a:graphic>
+            <wp14:sizeRelH relativeFrom="margin">
+              <wp14:pctWidth>0</wp14:pctWidth>
+            </wp14:sizeRelH>
+            <wp14:sizeRelV relativeFrom="margin">
+              <wp14:pctHeight>0</wp14:pctHeight>
+            </wp14:sizeRelV>
+          </wp:anchor>
+        </w:drawing>
+      </w:r>
+      <w:r>
+        <w:br w:type="page"/>
+      </w:r>
+    </w:p>
+    <w:p>
+      <w:r>
+        <w:rPr>
+          <w:noProof/>
+        </w:rPr>
+        <w:lastRenderedPageBreak/>
+        <w:drawing>
+          <wp:anchor distT="0" distB="0" distL="114300" distR="114300" simplePos="0" relativeHeight="251670528" behindDoc="1" locked="0" layoutInCell="1" allowOverlap="1" wp14:anchorId="05EAEE39" wp14:editId="702F530D">
+            <wp:simplePos x="0" y="0"/>
+            <wp:positionH relativeFrom="column">
+              <wp:posOffset>3628450</wp:posOffset>
+            </wp:positionH>
+            <wp:positionV relativeFrom="paragraph">
+              <wp:posOffset>-349885</wp:posOffset>
+            </wp:positionV>
+            <wp:extent cx="2131348" cy="4680000"/>
+            <wp:effectExtent l="0" t="0" r="2540" b="6350"/>
+            <wp:wrapNone/>
+            <wp:docPr id="64687865" name="Picture 13"/>
+            <wp:cNvGraphicFramePr>
+              <a:graphicFrameLocks xmlns:a="http://schemas.openxmlformats.org/drawingml/2006/main" noChangeAspect="1"/>
+            </wp:cNvGraphicFramePr>
+            <a:graphic xmlns:a="http://schemas.openxmlformats.org/drawingml/2006/main">
+              <a:graphicData uri="http://schemas.openxmlformats.org/drawingml/2006/picture">
+                <pic:pic xmlns:pic="http://schemas.openxmlformats.org/drawingml/2006/picture">
+                  <pic:nvPicPr>
+                    <pic:cNvPr id="64687865" name="Picture 64687865"/>
+                    <pic:cNvPicPr/>
+                  </pic:nvPicPr>
+                  <pic:blipFill>
+                    <a:blip r:embed="rId17">
+                      <a:extLst>
+                        <a:ext uri="{28A0092B-C50C-407E-A947-70E740481C1C}">
+                          <a14:useLocalDpi xmlns:a14="http://schemas.microsoft.com/office/drawing/2010/main" val="0"/>
+                        </a:ext>
+                      </a:extLst>
+                    </a:blip>
+                    <a:stretch>
+                      <a:fillRect/>
+                    </a:stretch>
+                  </pic:blipFill>
+                  <pic:spPr>
+                    <a:xfrm>
+                      <a:off x="0" y="0"/>
+                      <a:ext cx="2131348" cy="4680000"/>
+                    </a:xfrm>
+                    <a:prstGeom prst="rect">
+                      <a:avLst/>
+                    </a:prstGeom>
+                  </pic:spPr>
+                </pic:pic>
+              </a:graphicData>
+            </a:graphic>
+            <wp14:sizeRelH relativeFrom="margin">
+              <wp14:pctWidth>0</wp14:pctWidth>
+            </wp14:sizeRelH>
+            <wp14:sizeRelV relativeFrom="margin">
+              <wp14:pctHeight>0</wp14:pctHeight>
+            </wp14:sizeRelV>
+          </wp:anchor>
+        </w:drawing>
+      </w:r>
+      <w:r>
+        <w:rPr>
+          <w:noProof/>
+        </w:rPr>
+        <w:drawing>
+          <wp:anchor distT="0" distB="0" distL="114300" distR="114300" simplePos="0" relativeHeight="251662336" behindDoc="1" locked="0" layoutInCell="1" allowOverlap="1" wp14:anchorId="34157A3A" wp14:editId="5FE2CCE5">
+            <wp:simplePos x="0" y="0"/>
+            <wp:positionH relativeFrom="margin">
+              <wp:posOffset>3990</wp:posOffset>
+            </wp:positionH>
+            <wp:positionV relativeFrom="paragraph">
+              <wp:posOffset>-359542</wp:posOffset>
+            </wp:positionV>
+            <wp:extent cx="2121046" cy="4680000"/>
+            <wp:effectExtent l="0" t="0" r="0" b="6350"/>
+            <wp:wrapNone/>
+            <wp:docPr id="1689981965" name="Picture 5"/>
+            <wp:cNvGraphicFramePr>
+              <a:graphicFrameLocks xmlns:a="http://schemas.openxmlformats.org/drawingml/2006/main" noChangeAspect="1"/>
+            </wp:cNvGraphicFramePr>
+            <a:graphic xmlns:a="http://schemas.openxmlformats.org/drawingml/2006/main">
+              <a:graphicData uri="http://schemas.openxmlformats.org/drawingml/2006/picture">
+                <pic:pic xmlns:pic="http://schemas.openxmlformats.org/drawingml/2006/picture">
+                  <pic:nvPicPr>
+                    <pic:cNvPr id="1689981965" name="Picture 1689981965"/>
+                    <pic:cNvPicPr/>
+                  </pic:nvPicPr>
+                  <pic:blipFill>
+                    <a:blip r:embed="rId18">
+                      <a:extLst>
+                        <a:ext uri="{28A0092B-C50C-407E-A947-70E740481C1C}">
+                          <a14:useLocalDpi xmlns:a14="http://schemas.microsoft.com/office/drawing/2010/main" val="0"/>
+                        </a:ext>
+                      </a:extLst>
+                    </a:blip>
+                    <a:stretch>
+                      <a:fillRect/>
+                    </a:stretch>
+                  </pic:blipFill>
+                  <pic:spPr>
+                    <a:xfrm>
+                      <a:off x="0" y="0"/>
+                      <a:ext cx="2121046" cy="4680000"/>
+                    </a:xfrm>
+                    <a:prstGeom prst="rect">
+                      <a:avLst/>
+                    </a:prstGeom>
+                  </pic:spPr>
+                </pic:pic>
+              </a:graphicData>
+            </a:graphic>
+            <wp14:sizeRelH relativeFrom="margin">
+              <wp14:pctWidth>0</wp14:pctWidth>
+            </wp14:sizeRelH>
+            <wp14:sizeRelV relativeFrom="margin">
+              <wp14:pctHeight>0</wp14:pctHeight>
+            </wp14:sizeRelV>
+          </wp:anchor>
+        </w:drawing>
+      </w:r>
+    </w:p>
     <w:sectPr>
       <w:pgSz w:w="11906" w:h="16838"/>
       <w:pgMar w:top="1440" w:right="1440" w:bottom="1440" w:left="1440" w:header="708" w:footer="708" w:gutter="0"/>

</xml_diff>